<commit_message>
JETCAB: documento de pendientes sin páginas en blanco, con cierre de agradecimiento y lema de Rankeo
Co-Authored-By: Claude Opus 5.5 <noreply@anthropic.com>
Claude-Session: https://claude.ai/code/session_01RNGm2ytKyroHBVm7EZT9UE
</commit_message>
<xml_diff>
--- a/JETCAB-lo-que-necesitamos-oct2026.docx
+++ b/JETCAB-lo-que-necesitamos-oct2026.docx
@@ -4358,6 +4358,116 @@
     </w:tbl>
     <w:p>
       <w:pPr>
+        <w:spacing w:after="40"/>
+      </w:pPr>
+    </w:p>
+    <w:tbl>
+      <w:tblPr>
+        <w:tblW w:type="auto" w:w="0"/>
+        <w:tblLook w:firstColumn="1" w:firstRow="1" w:lastColumn="0" w:lastRow="0" w:noHBand="0" w:noVBand="1" w:val="04A0"/>
+      </w:tblPr>
+      <w:tblGrid>
+        <w:gridCol w:w="9866"/>
+      </w:tblGrid>
+      <w:tr>
+        <w:trPr>
+          <w:cantSplit/>
+        </w:trPr>
+        <w:tc>
+          <w:tcPr>
+            <w:tcW w:type="dxa" w:w="9865"/>
+            <w:shd w:val="clear" w:color="auto" w:fill="0A0908"/>
+            <w:tcBorders>
+              <w:top w:val="nil"/>
+              <w:left w:val="nil"/>
+              <w:bottom w:val="nil"/>
+              <w:right w:val="nil"/>
+            </w:tcBorders>
+            <w:tcMar>
+              <w:top w:w="300" w:type="dxa"/>
+              <w:left w:w="340" w:type="dxa"/>
+              <w:bottom w:w="300" w:type="dxa"/>
+              <w:right w:w="340" w:type="dxa"/>
+            </w:tcMar>
+          </w:tcPr>
+          <w:p>
+            <w:pPr>
+              <w:spacing w:after="120" w:before="0"/>
+            </w:pPr>
+            <w:r>
+              <w:rPr>
+                <w:rFonts w:ascii="Arial" w:hAnsi="Arial" w:eastAsia="Arial"/>
+                <w:b/>
+                <w:i w:val="0"/>
+                <w:color w:val="FFFFFF"/>
+                <w:sz w:val="30"/>
+              </w:rPr>
+              <w:t>Gracias por su confianza</w:t>
+            </w:r>
+          </w:p>
+          <w:p>
+            <w:pPr>
+              <w:spacing w:after="200" w:before="0"/>
+            </w:pPr>
+            <w:r>
+              <w:rPr>
+                <w:rFonts w:ascii="Arial" w:hAnsi="Arial" w:eastAsia="Arial"/>
+                <w:b w:val="0"/>
+                <w:i w:val="0"/>
+                <w:color w:val="C8C4BF"/>
+                <w:sz w:val="21"/>
+              </w:rPr>
+              <w:t>Gracias por el tiempo que se toman para responder. Cada dato que nos comparten se convierte en contenido más preciso, en un perfil de Google más completo y en más clientes que los encuentran a ustedes primero. Si algo no queda claro, con gusto lo revisamos juntos por WhatsApp o en una llamada.</w:t>
+            </w:r>
+          </w:p>
+          <w:p>
+            <w:pPr>
+              <w:spacing w:after="200" w:before="0"/>
+            </w:pPr>
+            <w:r>
+              <w:rPr>
+                <w:rFonts w:ascii="Arial" w:hAnsi="Arial" w:eastAsia="Arial"/>
+                <w:b/>
+                <w:i w:val="0"/>
+                <w:color w:val="F04E23"/>
+                <w:sz w:val="24"/>
+              </w:rPr>
+              <w:t>«Tus clientes ya no solo buscan en Google. Nosotros decidimos dónde apareces: en todos.»</w:t>
+            </w:r>
+          </w:p>
+          <w:p>
+            <w:pPr>
+              <w:spacing w:after="0" w:before="0"/>
+            </w:pPr>
+            <w:r>
+              <w:rPr>
+                <w:rFonts w:ascii="Arial" w:hAnsi="Arial" w:eastAsia="Arial"/>
+                <w:b/>
+                <w:i w:val="0"/>
+                <w:color w:val="FFFFFF"/>
+                <w:sz w:val="21"/>
+              </w:rPr>
+              <w:t>Luis Díaz</w:t>
+            </w:r>
+            <w:r>
+              <w:br/>
+            </w:r>
+            <w:r>
+              <w:rPr>
+                <w:rFonts w:ascii="Arial" w:hAnsi="Arial" w:eastAsia="Arial"/>
+                <w:b w:val="0"/>
+                <w:i w:val="0"/>
+                <w:color w:val="8A8682"/>
+                <w:sz w:val="19"/>
+              </w:rPr>
+              <w:t>Fundador, Rankeo</w:t>
+            </w:r>
+          </w:p>
+        </w:tc>
+      </w:tr>
+    </w:tbl>
+    <w:p>
+      <w:pPr>
         <w:keepLines/>
         <w:spacing w:before="240" w:after="0"/>
       </w:pPr>

</xml_diff>